<commit_message>
Week 7 ablations on harness v2 (official metric): -0.9 to -1.9 pts vs 77.8
AB-103 no values 76.4 | AB-104 no retriever 75.9 | AB-105 no FK 76.9 |
AB-106 no selection 76.0. Report v2, Excel/CSV log, ablation write-up updated.

Co-Authored-By: Claude Opus 5.5 <noreply@anthropic.com>
</commit_message>
<xml_diff>
--- a/docs/Code_Reproducibility_Report_v2.docx
+++ b/docs/Code_Reproducibility_Report_v2.docx
@@ -269,7 +269,7 @@
           <w:sz w:val="22"/>
           <w:szCs w:val="22"/>
         </w:rPr>
-        <w:t>Summary of status: the released CodeS-1B model has been loaded, has generated valid SQL, and that SQL has executed correctly on both a CUDA GPU (Colab T4) and Apple Silicon (M4). The Tier-2 Spider evaluation was run over the full 1,034-example development set several times as the pipeline was brought closer to the authors’ code. A line-by-line audit against the authors’ repository then found that the earlier runs used a simpler scoring metric than the paper and contained a value-retriever bug. With both corrected (run T2-005), scored with the official Spider evaluator that the authors use, the reproduction reaches 77.8% Execution Accuracy against the paper’s reported 77.9% — a difference of 0.1 points, well inside the SOP’s ±5% tolerance. A four-component ablation study (Week 7) shows every part of the CodeS database prompt contributes 1.5–2.7 points.</w:t>
+        <w:t>Summary of status: the released CodeS-1B model has been loaded, has generated valid SQL, and that SQL has executed correctly on both a CUDA GPU (Colab T4) and Apple Silicon (M4). The Tier-2 Spider evaluation was run over the full 1,034-example development set several times as the pipeline was brought closer to the authors’ code. A line-by-line audit against the authors’ repository then found that the earlier runs used a simpler scoring metric than the paper and contained a value-retriever bug. With both corrected (run T2-005), scored with the official Spider evaluator that the authors use, the reproduction reaches 77.8% Execution Accuracy against the paper’s reported 77.9% — a difference of 0.1 points, well inside the SOP’s ±5% tolerance. A four-component ablation study (Week 7), scored with the same official evaluator, shows every part of the pipeline contributes 0.9–1.9 points.</w:t>
       </w:r>
     </w:p>
     <w:p>
@@ -3999,7 +3999,7 @@
           <w:sz w:val="22"/>
           <w:szCs w:val="22"/>
         </w:rPr>
-        <w:t>Each component of the CodeS database prompt, and the candidate-selection rule, was disabled in turn and the full dev set re-evaluated (Colab T4, deterministic decoding). The table reports the harness-v1 measurements, scored with the simple metric against the T2-003 baseline of 73.8%; because every run shares the same harness and metric the differences are valid, and a re-measurement on harness v2 with the official metric is in progress. Every component contributes; the value retriever contributes most, and — tellingly — removing it hardly changes how many queries execute: the model still writes runnable SQL, but with wrong literal values, i.e. silently wrong answers. That failure mode is exactly what the planned confidence-aware abstention targets.</w:t>
+        <w:t>Each component of the CodeS database prompt, and the candidate-selection rule, was disabled in turn and the full dev set re-evaluated on harness v2 (Colab T4, deterministic decoding), scored with the official Spider evaluator against the T2-005 baseline of 77.8%. Every component contributes. The value retriever and candidate selection matter most (−1.9 and −1.8 points), followed by representative values (−1.4) and foreign keys (−0.9). Removing the value retriever hardly changes how many queries execute (97.2% vs 97.3%): the model still writes runnable SQL, but with wrong literal values, i.e. silently wrong answers — exactly the failure mode the planned confidence-aware abstention targets. Candidate selection works differently: it is the ablation that moves executability most (94.1%). The drops are 9–20 questions out of 1,034 and have not yet been tested for statistical significance (a paired McNemar test on the saved prediction files is planned). An earlier measurement on harness v1 with the simple metric gave the same ranking at the top, with larger drops of 1.5–2.7 points (results/week7_ablation_study.md).</w:t>
       </w:r>
     </w:p>
     <w:tbl>
@@ -4105,7 +4105,7 @@
                 <w:sz w:val="20"/>
                 <w:szCs w:val="20"/>
               </w:rPr>
-              <w:t>EX (%) [simple]</w:t>
+              <w:t>Official EX (%)</w:t>
             </w:r>
           </w:p>
         </w:tc>
@@ -4161,7 +4161,7 @@
                 <w:sz w:val="20"/>
                 <w:szCs w:val="20"/>
               </w:rPr>
-              <w:t>Δ vs 73.8</w:t>
+              <w:t>Δ vs 77.8</w:t>
             </w:r>
           </w:p>
         </w:tc>
@@ -4191,7 +4191,7 @@
                 <w:sz w:val="20"/>
                 <w:szCs w:val="20"/>
               </w:rPr>
-              <w:t>AB-003</w:t>
+              <w:t>AB-105</w:t>
             </w:r>
           </w:p>
         </w:tc>
@@ -4219,7 +4219,7 @@
                 <w:sz w:val="20"/>
                 <w:szCs w:val="20"/>
               </w:rPr>
-              <w:t>representative column values</w:t>
+              <w:t>foreign-keys block</w:t>
             </w:r>
           </w:p>
         </w:tc>
@@ -4247,7 +4247,7 @@
                 <w:sz w:val="20"/>
                 <w:szCs w:val="20"/>
               </w:rPr>
-              <w:t>72.2</w:t>
+              <w:t>76.9</w:t>
             </w:r>
           </w:p>
         </w:tc>
@@ -4275,7 +4275,7 @@
                 <w:sz w:val="20"/>
                 <w:szCs w:val="20"/>
               </w:rPr>
-              <w:t>97.8%</w:t>
+              <w:t>95.9%</w:t>
             </w:r>
           </w:p>
         </w:tc>
@@ -4303,7 +4303,7 @@
                 <w:sz w:val="20"/>
                 <w:szCs w:val="20"/>
               </w:rPr>
-              <w:t>−1.55</w:t>
+              <w:t>−0.9</w:t>
             </w:r>
           </w:p>
         </w:tc>
@@ -4333,7 +4333,7 @@
                 <w:sz w:val="20"/>
                 <w:szCs w:val="20"/>
               </w:rPr>
-              <w:t>AB-005</w:t>
+              <w:t>AB-103</w:t>
             </w:r>
           </w:p>
         </w:tc>
@@ -4361,7 +4361,7 @@
                 <w:sz w:val="20"/>
                 <w:szCs w:val="20"/>
               </w:rPr>
-              <w:t>foreign-keys block</w:t>
+              <w:t>representative column values</w:t>
             </w:r>
           </w:p>
         </w:tc>
@@ -4389,7 +4389,7 @@
                 <w:sz w:val="20"/>
                 <w:szCs w:val="20"/>
               </w:rPr>
-              <w:t>72.2</w:t>
+              <w:t>76.4</w:t>
             </w:r>
           </w:p>
         </w:tc>
@@ -4417,7 +4417,7 @@
                 <w:sz w:val="20"/>
                 <w:szCs w:val="20"/>
               </w:rPr>
-              <w:t>95.5%</w:t>
+              <w:t>98.1%</w:t>
             </w:r>
           </w:p>
         </w:tc>
@@ -4445,7 +4445,7 @@
                 <w:sz w:val="20"/>
                 <w:szCs w:val="20"/>
               </w:rPr>
-              <w:t>−1.55</w:t>
+              <w:t>−1.4</w:t>
             </w:r>
           </w:p>
         </w:tc>
@@ -4475,7 +4475,7 @@
                 <w:sz w:val="20"/>
                 <w:szCs w:val="20"/>
               </w:rPr>
-              <w:t>AB-006</w:t>
+              <w:t>AB-106</w:t>
             </w:r>
           </w:p>
         </w:tc>
@@ -4531,7 +4531,7 @@
                 <w:sz w:val="20"/>
                 <w:szCs w:val="20"/>
               </w:rPr>
-              <w:t>71.7</w:t>
+              <w:t>76.0</w:t>
             </w:r>
           </w:p>
         </w:tc>
@@ -4559,7 +4559,7 @@
                 <w:sz w:val="20"/>
                 <w:szCs w:val="20"/>
               </w:rPr>
-              <w:t>93.5%</w:t>
+              <w:t>94.1%</w:t>
             </w:r>
           </w:p>
         </w:tc>
@@ -4587,7 +4587,7 @@
                 <w:sz w:val="20"/>
                 <w:szCs w:val="20"/>
               </w:rPr>
-              <w:t>−2.13</w:t>
+              <w:t>−1.8</w:t>
             </w:r>
           </w:p>
         </w:tc>
@@ -4617,7 +4617,7 @@
                 <w:sz w:val="20"/>
                 <w:szCs w:val="20"/>
               </w:rPr>
-              <w:t>AB-004</w:t>
+              <w:t>AB-104</w:t>
             </w:r>
           </w:p>
         </w:tc>
@@ -4673,7 +4673,7 @@
                 <w:sz w:val="20"/>
                 <w:szCs w:val="20"/>
               </w:rPr>
-              <w:t>71.1</w:t>
+              <w:t>75.9</w:t>
             </w:r>
           </w:p>
         </w:tc>
@@ -4701,7 +4701,7 @@
                 <w:sz w:val="20"/>
                 <w:szCs w:val="20"/>
               </w:rPr>
-              <w:t>96.8%</w:t>
+              <w:t>97.2%</w:t>
             </w:r>
           </w:p>
         </w:tc>
@@ -4729,7 +4729,7 @@
                 <w:sz w:val="20"/>
                 <w:szCs w:val="20"/>
               </w:rPr>
-              <w:t>−2.71</w:t>
+              <w:t>−1.9</w:t>
             </w:r>
           </w:p>
         </w:tc>
@@ -7111,7 +7111,7 @@
           <w:sz w:val="22"/>
           <w:szCs w:val="22"/>
         </w:rPr>
-        <w:t>Next-review work: re-measure the Week-7 ablations on harness v2 with the official metric; score the saved predictions for Test-suite accuracy; evaluate CodeS-3B (paper: 83.4%) on the same harness; and write the Month-3 enhancement proposal (execution-guided self-correction and confidence-aware abstention) against the reproduced 77.8% baseline.</w:t>
+        <w:t>Next-review work: test the ablation differences for significance (McNemar); score the saved predictions for Test-suite accuracy; evaluate CodeS-3B (paper: 83.4%) on the same harness; and write the Month-3 enhancement proposal (execution-guided self-correction and confidence-aware abstention) against the reproduced 77.8% baseline.</w:t>
       </w:r>
     </w:p>
     <w:p>

</xml_diff>

<commit_message>
Team: add M Praneeth Reddy (2320090018); spelling Boddupally Narendar
Updated current documents (final report, reproducibility report v2, Review-3
deck, enhancement proposal, Week-12 results, Week-3 worksheet spelling),
README, NOTICE and CLAUDE.md. Already-presented documents (Review-II deck,
Week-1 deck, report v1) are left as submitted; past weekly reports unchanged
pending the join date.

Co-Authored-By: Claude Opus 5.5 <noreply@anthropic.com>
</commit_message>
<xml_diff>
--- a/docs/Code_Reproducibility_Report_v2.docx
+++ b/docs/Code_Reproducibility_Report_v2.docx
@@ -108,7 +108,21 @@
           <w:sz w:val="22"/>
           <w:szCs w:val="22"/>
         </w:rPr>
-        <w:t xml:space="preserve">2320090009 — Bodupally Narendar</w:t>
+        <w:t>2320090009 — Boddupally Narendar</w:t>
+      </w:r>
+    </w:p>
+    <w:p>
+      <w:pPr>
+        <w:spacing w:after="240" w:line="276"/>
+        <w:jc w:val="center"/>
+      </w:pPr>
+      <w:r>
+        <w:rPr>
+          <w:rFonts w:ascii="Calibri" w:cs="Calibri" w:eastAsia="Calibri" w:hAnsi="Calibri"/>
+          <w:sz w:val="22"/>
+          <w:szCs w:val="22"/>
+        </w:rPr>
+        <w:t>2320090018 — M Praneeth Reddy</w:t>
       </w:r>
     </w:p>
     <w:p>

</xml_diff>